<commit_message>
Make securitization and MBS transmission explicit
Co-authored-by: arena-agent <297053741+arena-agent@users.noreply.github.com>
</commit_message>
<xml_diff>
--- a/travaux-groupe/Money-Banking/ch10_front_office_illustrations/CH10_slides_9_10_editable.docx
+++ b/travaux-groupe/Money-Banking/ch10_front_office_illustrations/CH10_slides_9_10_editable.docx
@@ -54,7 +54,7 @@
           <w:color w:val="667085"/>
           <w:sz w:val="19"/>
         </w:rPr>
-        <w:t>As credit becomes scalable and distributable, subprime originations expand in volume and share.</w:t>
+        <w:t>Through securitization, banks were able to originate and distribute a growing volume of mortgage loans, including riskier subprime mortgages.</w:t>
       </w:r>
     </w:p>
     <w:p>
@@ -203,7 +203,7 @@
                 <w:color w:val="243447"/>
                 <w:sz w:val="17"/>
               </w:rPr>
-              <w:t>The chart shows scale, not a causal proof. Originations rise from $190bn in 2001 to $625bn in 2005, while the subprime share rises from about 9% to 23.8% in the table’s definition.</w:t>
+              <w:t>Securitization enabled banks to originate more mortgage loans by packaging and selling them to investors. As a result, subprime mortgage originations increased dramatically between 2001 and 2006.</w:t>
             </w:r>
           </w:p>
         </w:tc>
@@ -456,7 +456,9 @@
                 <w:color w:val="243447"/>
                 <w:sz w:val="17"/>
               </w:rPr>
-              <w:t>Serious delinquency means 90+ days past due or in foreclosure. This is an economic mechanism, not a single-cause proof: rate resets, underwriting, leverage, income shocks and liquidity also matter.</w:t>
+              <w:t>When house prices started falling after 2006, many subprime borrowers were unable to refinance or repay their mortgages. Delinquencies rose sharply, reducing the value of mortgage-backed securities and generating losses across the financial system.</w:t>
+              <w:br/>
+              <w:t>Narrative bridge: subprime growth → securitization boom → mortgage exposure → housing downturn → defaults → MBS losses → financial crisis.</w:t>
             </w:r>
           </w:p>
         </w:tc>

</xml_diff>